<commit_message>
fix: add audit signature field to receipt template
</commit_message>
<xml_diff>
--- a/template/模板.docx
+++ b/template/模板.docx
@@ -2159,6 +2159,11 @@
           </w:tcPr>
           <w:p>
             <w:pPr>
+              <w:tabs>
+                <w:tab w:val="left" w:pos="2160"/>
+                <w:tab w:val="left" w:pos="4320"/>
+                <w:tab w:val="left" w:pos="6480"/>
+              </w:tabs>
               <w:rPr>
                 <w:sz w:val="28"/>
                 <w:szCs w:val="28"/>
@@ -2170,92 +2175,13 @@
                 <w:sz w:val="28"/>
                 <w:szCs w:val="28"/>
               </w:rPr>
-              <w:t xml:space="preserve">采购：    </w:t>
-            </w:r>
-            <w:r>
-              <w:rPr>
-                <w:sz w:val="28"/>
-                <w:szCs w:val="28"/>
-              </w:rPr>
-              <w:t xml:space="preserve">  </w:t>
-            </w:r>
-            <w:r>
-              <w:rPr>
-                <w:rFonts w:hint="eastAsia"/>
-                <w:sz w:val="28"/>
-                <w:szCs w:val="28"/>
-                <w:lang w:val="en-US" w:eastAsia="zh-CN"/>
-              </w:rPr>
-              <w:t xml:space="preserve">  </w:t>
-            </w:r>
-            <w:r>
-              <w:rPr>
-                <w:sz w:val="28"/>
-                <w:szCs w:val="28"/>
-              </w:rPr>
-              <w:t xml:space="preserve">       </w:t>
-            </w:r>
-            <w:r>
-              <w:rPr>
-                <w:rFonts w:hint="eastAsia"/>
-                <w:sz w:val="28"/>
-                <w:szCs w:val="28"/>
-              </w:rPr>
-              <w:t xml:space="preserve">验收：    </w:t>
-            </w:r>
-            <w:r>
-              <w:rPr>
-                <w:sz w:val="28"/>
-                <w:szCs w:val="28"/>
-              </w:rPr>
-              <w:t xml:space="preserve"> </w:t>
-            </w:r>
-            <w:r>
-              <w:rPr>
-                <w:rFonts w:hint="eastAsia"/>
-                <w:sz w:val="28"/>
-                <w:szCs w:val="28"/>
-                <w:lang w:val="en-US" w:eastAsia="zh-CN"/>
-              </w:rPr>
-              <w:t xml:space="preserve"> </w:t>
-            </w:r>
-            <w:r>
-              <w:rPr>
-                <w:sz w:val="28"/>
-                <w:szCs w:val="28"/>
-              </w:rPr>
-              <w:t xml:space="preserve">    </w:t>
-            </w:r>
-            <w:r>
-              <w:rPr>
-                <w:rFonts w:hint="eastAsia"/>
-                <w:sz w:val="28"/>
-                <w:szCs w:val="28"/>
-                <w:lang w:val="en-US" w:eastAsia="zh-CN"/>
-              </w:rPr>
-              <w:t xml:space="preserve">  </w:t>
-            </w:r>
-            <w:r>
-              <w:rPr>
-                <w:sz w:val="28"/>
-                <w:szCs w:val="28"/>
-              </w:rPr>
-              <w:t xml:space="preserve"> </w:t>
-            </w:r>
-            <w:r>
-              <w:rPr>
-                <w:rFonts w:hint="eastAsia"/>
-                <w:sz w:val="28"/>
-                <w:szCs w:val="28"/>
-              </w:rPr>
-              <w:t xml:space="preserve">保管：    </w:t>
-            </w:r>
-            <w:r>
-              <w:rPr>
-                <w:sz w:val="28"/>
-                <w:szCs w:val="28"/>
-              </w:rPr>
-              <w:t xml:space="preserve">       </w:t>
+              <w:t>采购：</w:t>
+              <w:tab/>
+              <w:t>验收：</w:t>
+              <w:tab/>
+              <w:t>保管：</w:t>
+              <w:tab/>
+              <w:t>审核：</w:t>
             </w:r>
           </w:p>
         </w:tc>

</xml_diff>